<commit_message>
Release Forge 0.9 editor-quality systems
Add static, mixed and dynamic lighting with shadow casters, receiver channels, soft/partial shadows, illumination sampling and perception/stealth primitives.

Add editor recovery snapshots, lighting/perception gizmos, script editing and rich Inspector metadata, automatic UI contrast controls, and the mobile/tablet workspace.

Add optional account/project sync with revision conflict protection, session/rate-limit hardening, the Lantern Shadow & Stealth Lab, web examples, documentation and expanded regression coverage.
</commit_message>
<xml_diff>
--- a/docs/Forge-Prototype-Workshop.docx
+++ b/docs/Forge-Prototype-Workshop.docx
@@ -1280,7 +1280,7 @@
     </w:p>
     <w:p>
       <w:r>
-        <w:t>Create four empty entities and add Light 2D to each. These settings match the completed examples. Keep Transform scale at 1; light dimensions use world units. Aim Spotlight down and right with approximately 23 degrees of rotation. For an exact Inspector entry, set a=0.921061, b=0.389418, c=-0.389418 and d=0.921061; retain its x and y.</w:t>
+        <w:t>Create four empty entities and add Light 2D to each. These settings are a readable baseline; the dedicated Lantern Shadow Lab example below pushes them further. Keep Transform scale at 1; light dimensions use world units. Aim Spotlight down and right with approximately 23 degrees of rotation. For an exact Inspector entry, set a=0.921061, b=0.389418, c=-0.389418 and d=0.921061; retain its x and y. Set Ambient, Cool area and Spotlight to static; set Warm pool to mixed.</w:t>
       </w:r>
     </w:p>
     <w:tbl>
@@ -1735,7 +1735,6 @@
       </w:r>
     </w:p>
     <w:p>
-      <w:r/>
       <w:r>
         <w:rPr>
           <w:b/>
@@ -1743,16 +1742,15 @@
         <w:t>What this renderer computes.</w:t>
       </w:r>
       <w:r>
-        <w:t xml:space="preserve"> Each sprite samples the light field at its visual center. Contributions accumulate and multiply the sprite's tint. This gives colored lighting and spatial variation between sprites. It does not create a gradient across one large sprite, surface normals, cast shadows, occlusion or bloom. A floor built from many tiles can show variation that a single large rectangle cannot.</w:t>
+        <w:t xml:space="preserve"> With at least one active light, Forge builds a screen-space light surface. Point and spot lights create visible gradients across large floors and walls instead of tinting a whole sprite from one center sample; area lights emit from a rotated rectangle. Contributions accumulate and multiply the rendered scene. The model is deliberately LDR: it has no normal maps, HDR energy model or bloom.</w:t>
       </w:r>
     </w:p>
     <w:p>
       <w:r>
-        <w:t>With no active lights, sprites retain their original appearance. Adding an active light enables illumination; an intensity-zero light still counts. Start with ambient fill so objects outside local light ranges remain readable. Uncheck a sprite's lit property for HUD, signs or emissive-looking markers. Camera background is not lit.</w:t>
+        <w:t>With no active lights, sprites retain their original appearance. Start with a low ambient fill so objects outside local light ranges remain readable. Uncheck a sprite's Lit property for HUD, signs or emissive-looking markers. Enable Cast Shadow on Sprite Renderer for rectangular sprite occlusion, or add Shadow Caster 2D when the blocking geometry should be invisible or differ from the sprite. Ambient light is never shadowed.</w:t>
       </w:r>
     </w:p>
     <w:p>
-      <w:r/>
       <w:r>
         <w:rPr>
           <w:b/>
@@ -1760,7 +1758,19 @@
         <w:t>Exercise.</w:t>
       </w:r>
       <w:r>
-        <w:t xml:space="preserve"> Lower Ambient intensity to 0.2, move Warm pool across the actor, then rotate Spotlight by 180 degrees. Observe the light color and falloff on the actor. Restore the table values afterwards. Raising intensity beyond 1 is allowed, but combined channel gains clamp to 1 in this LDR tint model; it cannot generate HDR glow.</w:t>
+        <w:t xml:space="preserve"> Lower Ambient intensity to 0.2 and enable Cast Shadow on a wall or platform between Warm pool and the actor. Move the light in Edit mode and watch the illuminated surface and projected shadow update. Then switch Warm pool to dynamic, parent it to the actor and Play: the pool now travels with the actor. A mixed light keeps its authored light definition fixed at runtime but recomputes shadows from moving casters; a static light also snapshots caster geometry. Raising intensity beyond 1 is allowed, but the LDR result saturates rather than producing HDR glow.</w:t>
+      </w:r>
+    </w:p>
+    <w:p>
+      <w:pPr/>
+      <w:r>
+        <w:rPr>
+          <w:b/>
+        </w:rPr>
+        <w:t>Reference example.</w:t>
+      </w:r>
+      <w:r>
+        <w:t xml:space="preserve"> Import examples/lighting-shadow-demo/lighting-shadow-demo.forge.json. Lantern Shadow Lab combines a dim static ambient fill, static fixtures, a mixed fixed lamp with live caster shadows, a dynamic player torch and shadow-casting platforms. Scripts can use ctx.illumination() or ctx.lightAt(x, y) to turn the same attenuation/occlusion rules into stealth exposure checks.</w:t>
       </w:r>
     </w:p>
     <w:p>
@@ -1897,7 +1907,7 @@
     </w:p>
     <w:p>
       <w:r>
-        <w:t>1. Select the entity that will own the game behaviour. Open Scripts and select its imported main file under Project script. Compile, then Attach to selection. Helpers.ts is an imported utility module; do not attach it to an entity.</w:t>
+        <w:t>1. Select the entity that will own the game behaviour. In Assets, double-click its imported .ts file (or use Scripts), Compile, Save, then Attach to selection. Ctrl/Cmd+S saves from the source editor, and unsaved source is protected as a browser-local draft. Helpers.ts is an imported utility module; do not attach it to an entity.</w:t>
       </w:r>
     </w:p>
     <w:p>
@@ -6143,7 +6153,6 @@
       </w:r>
     </w:p>
     <w:p>
-      <w:r/>
       <w:r>
         <w:rPr>
           <w:b/>
@@ -6151,7 +6160,19 @@
         <w:t>Useful source entry points.</w:t>
       </w:r>
       <w:r>
-        <w:t xml:space="preserve"> Read the main script in each example's Scripts folder for game rules; Helpers.ts for bars and sprite visibility; packages/scripting/src/runtime.ts for ScriptContext; packages/animation/src/index.ts for playback and transitions; packages/renderer/src/lighting.ts for illumination; and tests/prototypes.test.ts for executable gameplay checks. These local sources are the implementation authority for this workshop. docs/lighting.md, docs/animation-audio.md and docs/web-build.md provide focused references.</w:t>
+        <w:t xml:space="preserve"> Read the main script in each example's Scripts folder for game rules; Helpers.ts for bars and sprite visibility; packages/scripting/src/runtime.ts for ScriptContext; packages/animation/src/index.ts for playback and transitions; packages/renderer/src/lighting.ts for illumination; and tests/prototypes.test.ts for executable gameplay checks. These local sources are the implementation authority for this workshop. docs/lighting.md, docs/account-sync.md, docs/animation-audio.md and docs/web-build.md provide focused references.</w:t>
+      </w:r>
+    </w:p>
+    <w:p>
+      <w:pPr/>
+      <w:r>
+        <w:rPr>
+          <w:b/>
+        </w:rPr>
+        <w:t>Mobile, appearance and continuity.</w:t>
+      </w:r>
+      <w:r>
+        <w:t xml:space="preserve"> At 800 CSS pixels or below the editor switches to touch-sized Hierarchy, Scene, Inspector, Project, Console and Assets tabs; the Scene tab adds explicit Pan, zoom and Frame controls. Settings lets you choose the editor accent and surface colours while Forge derives readable foreground colours automatically. The Account dialog is optional: with npm run dev:account or a deployed Forge account server, projects can be saved and reopened across browsers/devices with revision-conflict protection. Local IndexedDB saves and JSON export continue to work independently.</w:t>
       </w:r>
     </w:p>
     <w:p>

</xml_diff>

<commit_message>
Release Forge 0.9.3 public alpha
Make local persistence explicit with Save locally/Open local actions, portable Export backup/Import project terminology, and first-run guidance that distinguishes browser storage from cross-device backups.

Add relative-path production hosting, GitHub Pages deployment automation and .nojekyll support so the complete static editor can run from a repository subpath without a backend.

Add public repository history/deployment documentation, cross-platform line-ending rules, updated workshop material, and launch-facing editor/project-format polish.
</commit_message>
<xml_diff>
--- a/docs/Forge-Prototype-Workshop.docx
+++ b/docs/Forge-Prototype-Workshop.docx
@@ -20,7 +20,7 @@
     </w:p>
     <w:p>
       <w:r>
-        <w:t>Forge 0.8 • September 2026 • Practical workshop</w:t>
+        <w:t>Forge 0.9.3 • September 2026 • Practical workshop</w:t>
       </w:r>
     </w:p>
     <w:p>
@@ -88,7 +88,7 @@
         <w:t>npm run dev</w:t>
       </w:r>
       <w:r>
-        <w:t xml:space="preserve">, then use Import JSON to open a project's </w:t>
+        <w:t xml:space="preserve">, then use Import project to open a project's </w:t>
       </w:r>
       <w:r>
         <w:rPr>
@@ -203,7 +203,7 @@
     </w:p>
     <w:p>
       <w:r>
-        <w:t>4. Use Save for the browser's project store and Export JSON for a portable project backup. Save storage belongs to that browser and origin, including its port. Export JSON before changing origins or clearing browser data.</w:t>
+        <w:t>4. Use Save locally for the browser's project store and Export backup for a portable .forge.json backup. Local storage belongs to that browser origin. Export a backup before changing origins/devices or clearing browser data.</w:t>
       </w:r>
     </w:p>
     <w:p>
@@ -4270,7 +4270,7 @@
     </w:p>
     <w:p>
       <w:r>
-        <w:t>5. Save and export the authored project. Stop/Play should start a new run: runtime progress is not written into the saved project.</w:t>
+        <w:t>5. Save locally and Export backup for the authored project. Stop/Play should start a new run: runtime progress is not written into the saved project.</w:t>
       </w:r>
     </w:p>
     <w:p>
@@ -5498,7 +5498,7 @@
     </w:p>
     <w:p>
       <w:r>
-        <w:t>4. Save, close and reopen your project. Confirm references and overrides survive. Export JSON before experimenting with destructive structural changes.</w:t>
+        <w:t>4. Save locally, close and reopen your project. Confirm references and overrides survive. Export a backup before experimenting with destructive structural changes.</w:t>
       </w:r>
     </w:p>
     <w:p>
@@ -5577,7 +5577,7 @@
     </w:p>
     <w:p>
       <w:r>
-        <w:t>3. Confirm loading stages advance, Start appears, and gameplay begins after clicking it. Switch away and return; use Resume. Test a win or defeat and R restart. Test sound after the user gesture.</w:t>
+        <w:t>3. Confirm loading stages advance, Start appears, and gameplay begins after clicking it. Switch away and return; use Resume. Test a win or defeat and R restart. Test sound after an interaction gesture.</w:t>
       </w:r>
     </w:p>
     <w:p>
@@ -6141,16 +6141,15 @@
       </w:pPr>
     </w:p>
     <w:p>
-      <w:r/>
+      <w:r>
+        <w:t>Verification evidence. The release's automated suite covers the three gameplay flows, real Rapier integration, compiled script modules, animation edits, loading feedback and lighting math. Production and export checks are recorded in the repository. Automated checks do not replace manual GPU, keyboard, audio and interaction verification in target browsers, so each example should also be playtested before release.</w:t>
+      </w:r>
       <w:r>
         <w:rPr>
           <w:b/>
         </w:rPr>
-        <w:t>Verification evidence.</w:t>
       </w:r>
-      <w:r>
-        <w:t xml:space="preserve"> The release's automated suite covers the three gameplay flows, real Rapier integration, compiled script modules, animation edits, loading feedback and lighting math. Production and export checks are recorded in the repository. Browser navigation in the build environment was blocked, so those checks do not establish GPU appearance or real keyboard/audio feel for every browser. The previously accepted preview polish is retained; the new examples still deserve your own playthrough.</w:t>
-      </w:r>
+      <w:r/>
     </w:p>
     <w:p>
       <w:r>
@@ -6166,25 +6165,12 @@
     <w:p>
       <w:pPr/>
       <w:r>
-        <w:rPr>
-          <w:b/>
-        </w:rPr>
-        <w:t>Mobile, appearance and continuity.</w:t>
-      </w:r>
-      <w:r>
-        <w:t xml:space="preserve"> At 800 CSS pixels or below the editor switches to touch-sized Hierarchy, Scene, Inspector, Project, Console and Assets tabs; the Scene tab adds explicit Pan, zoom and Frame controls. Settings lets you choose the editor accent and surface colours while Forge derives readable foreground colours automatically. The Account dialog is optional: with npm run dev:account or a deployed Forge account server, projects can be saved and reopened across browsers/devices with revision-conflict protection. Local IndexedDB saves and JSON export continue to work independently.</w:t>
+        <w:t>Mobile, appearance and continuity. At 800 CSS pixels or below the editor switches to touch-sized Hierarchy, Scene, Inspector, Project, Console and Assets tabs; the Scene tab adds explicit Pan, zoom and Frame controls. Settings lets you choose the editor accent and surface colours while Forge derives readable foreground colours automatically. Cloud sync is optional: with npm run dev:account or a deployed Forge account server, projects can be saved and reopened across browsers/devices with revision-conflict protection. The public GitHub Pages alpha needs no backend: Save locally uses IndexedDB, while Export backup/Import project provide portable cross-device continuity.</w:t>
       </w:r>
     </w:p>
     <w:p>
-      <w:r/>
       <w:r>
-        <w:rPr>
-          <w:b/>
-        </w:rPr>
-        <w:t>Next step.</w:t>
-      </w:r>
-      <w:r>
-        <w:t xml:space="preserve"> Choose one example and make a small original variation with a clear completion condition. Write three acceptance checks before adding features. Keep an exported playable build and a project JSON at each milestone. A useful portfolio extension should explain a design choice, demonstrate its implementation and show how you verified it—not merely add more systems.</w:t>
+        <w:t>Next step. Choose one example and make a small original variation with a clear completion condition. Write three acceptance checks before adding features. Keep an exported playable build and a .forge.json backup at each milestone. A useful portfolio extension should explain a design choice, demonstrate its implementation and show how you verified it—not merely add more systems.</w:t>
       </w:r>
     </w:p>
     <w:p>
@@ -6215,7 +6201,7 @@
       <w:rPr>
         <w:sz w:val="18"/>
       </w:rPr>
-      <w:t xml:space="preserve">Forge 0.8   •   </w:t>
+      <w:t xml:space="preserve">Forge 0.9.3   •   </w:t>
     </w:r>
     <w:fldSimple w:instr="PAGE"/>
   </w:p>

</xml_diff>